<commit_message>
added the new portfolio page
</commit_message>
<xml_diff>
--- a/Spenceley_CV2025.docx
+++ b/Spenceley_CV2025.docx
@@ -21,7 +21,7 @@
           <w:szCs w:val="22"/>
         </w:rPr>
         <w:drawing>
-          <wp:anchor distT="0" distB="0" distL="114300" distR="114300" simplePos="0" relativeHeight="251658240" behindDoc="1" locked="0" layoutInCell="1" allowOverlap="1" wp14:anchorId="6D0059FC" wp14:editId="13C7C7F4">
+          <wp:anchor distT="0" distB="0" distL="114300" distR="114300" simplePos="0" relativeHeight="251658240" behindDoc="1" locked="0" layoutInCell="1" allowOverlap="1" wp14:anchorId="6D0059FC" wp14:editId="5B5C1049">
             <wp:simplePos x="0" y="0"/>
             <wp:positionH relativeFrom="column">
               <wp:posOffset>6036276</wp:posOffset>
@@ -754,7 +754,23 @@
           <w:sz w:val="22"/>
           <w:szCs w:val="22"/>
         </w:rPr>
-        <w:t xml:space="preserve">2020 – </w:t>
+        <w:t>202</w:t>
+      </w:r>
+      <w:r>
+        <w:rPr>
+          <w:rFonts w:ascii="Times New Roman" w:hAnsi="Times New Roman" w:cs="Times New Roman"/>
+          <w:sz w:val="22"/>
+          <w:szCs w:val="22"/>
+        </w:rPr>
+        <w:t>1</w:t>
+      </w:r>
+      <w:r>
+        <w:rPr>
+          <w:rFonts w:ascii="Times New Roman" w:hAnsi="Times New Roman" w:cs="Times New Roman"/>
+          <w:sz w:val="22"/>
+          <w:szCs w:val="22"/>
+        </w:rPr>
+        <w:t xml:space="preserve"> – </w:t>
       </w:r>
       <w:r>
         <w:rPr>
@@ -942,7 +958,33 @@
           <w:b/>
           <w:bCs/>
         </w:rPr>
-        <w:t xml:space="preserve"> – Neuroergonomics Lab</w:t>
+        <w:t xml:space="preserve"> – </w:t>
+      </w:r>
+      <w:proofErr w:type="spellStart"/>
+      <w:r>
+        <w:rPr>
+          <w:rFonts w:ascii="Times New Roman" w:hAnsi="Times New Roman" w:cs="Times New Roman"/>
+          <w:b/>
+          <w:bCs/>
+        </w:rPr>
+        <w:t>Neuroergonomics</w:t>
+      </w:r>
+      <w:proofErr w:type="spellEnd"/>
+      <w:r>
+        <w:rPr>
+          <w:rFonts w:ascii="Times New Roman" w:hAnsi="Times New Roman" w:cs="Times New Roman"/>
+          <w:b/>
+          <w:bCs/>
+        </w:rPr>
+        <w:t xml:space="preserve"> Lab</w:t>
+      </w:r>
+      <w:r>
+        <w:rPr>
+          <w:rFonts w:ascii="Times New Roman" w:hAnsi="Times New Roman" w:cs="Times New Roman"/>
+          <w:b/>
+          <w:bCs/>
+        </w:rPr>
+        <w:t xml:space="preserve"> </w:t>
       </w:r>
       <w:r>
         <w:rPr>
@@ -4707,6 +4749,14 @@
           <w:sz w:val="22"/>
           <w:szCs w:val="22"/>
         </w:rPr>
+        <w:t>, &amp; Delta Program Mentorship Certificate</w:t>
+      </w:r>
+      <w:r>
+        <w:rPr>
+          <w:rFonts w:ascii="Times New Roman" w:hAnsi="Times New Roman" w:cs="Times New Roman"/>
+          <w:sz w:val="22"/>
+          <w:szCs w:val="22"/>
+        </w:rPr>
         <w:t>.</w:t>
       </w:r>
     </w:p>
@@ -4767,8 +4817,6 @@
         </w:numPr>
         <w:rPr>
           <w:rFonts w:ascii="Times New Roman" w:hAnsi="Times New Roman" w:cs="Times New Roman"/>
-          <w:b/>
-          <w:bCs/>
           <w:sz w:val="22"/>
           <w:szCs w:val="22"/>
         </w:rPr>
@@ -4778,8 +4826,6 @@
       <w:r>
         <w:rPr>
           <w:rFonts w:ascii="Times New Roman" w:hAnsi="Times New Roman" w:cs="Times New Roman"/>
-          <w:b/>
-          <w:bCs/>
           <w:sz w:val="22"/>
           <w:szCs w:val="22"/>
         </w:rPr>
@@ -4790,8 +4836,6 @@
           <w:rPr>
             <w:rStyle w:val="Hyperlink"/>
             <w:rFonts w:ascii="Times New Roman" w:hAnsi="Times New Roman" w:cs="Times New Roman"/>
-            <w:b/>
-            <w:bCs/>
             <w:sz w:val="22"/>
             <w:szCs w:val="22"/>
           </w:rPr>
@@ -4801,12 +4845,26 @@
       <w:r>
         <w:rPr>
           <w:rFonts w:ascii="Times New Roman" w:hAnsi="Times New Roman" w:cs="Times New Roman"/>
-          <w:b/>
-          <w:bCs/>
-          <w:sz w:val="22"/>
-          <w:szCs w:val="22"/>
-        </w:rPr>
-        <w:t xml:space="preserve"> (2003), is the study of the human brain in relation to performance at work and everyday settings. </w:t>
+          <w:sz w:val="22"/>
+          <w:szCs w:val="22"/>
+        </w:rPr>
+        <w:t xml:space="preserve"> (2003), </w:t>
+      </w:r>
+      <w:r>
+        <w:rPr>
+          <w:rFonts w:ascii="Times New Roman" w:hAnsi="Times New Roman" w:cs="Times New Roman"/>
+          <w:sz w:val="22"/>
+          <w:szCs w:val="22"/>
+        </w:rPr>
+        <w:t>i</w:t>
+      </w:r>
+      <w:r>
+        <w:rPr>
+          <w:rFonts w:ascii="Times New Roman" w:hAnsi="Times New Roman" w:cs="Times New Roman"/>
+          <w:sz w:val="22"/>
+          <w:szCs w:val="22"/>
+        </w:rPr>
+        <w:t xml:space="preserve">s the study of the human brain in relation to performance at work and everyday settings. </w:t>
       </w:r>
     </w:p>
     <w:p>
@@ -4818,8 +4876,6 @@
         </w:numPr>
         <w:rPr>
           <w:rFonts w:ascii="Times New Roman" w:hAnsi="Times New Roman" w:cs="Times New Roman"/>
-          <w:b/>
-          <w:bCs/>
           <w:sz w:val="22"/>
           <w:szCs w:val="22"/>
         </w:rPr>
@@ -4829,8 +4885,6 @@
       <w:r>
         <w:rPr>
           <w:rFonts w:ascii="Times New Roman" w:hAnsi="Times New Roman" w:cs="Times New Roman"/>
-          <w:b/>
-          <w:bCs/>
           <w:sz w:val="22"/>
           <w:szCs w:val="22"/>
         </w:rPr>
@@ -4841,8 +4895,6 @@
           <w:rPr>
             <w:rStyle w:val="Hyperlink"/>
             <w:rFonts w:ascii="Times New Roman" w:hAnsi="Times New Roman" w:cs="Times New Roman"/>
-            <w:b/>
-            <w:bCs/>
             <w:sz w:val="22"/>
             <w:szCs w:val="22"/>
           </w:rPr>
@@ -4852,30 +4904,15 @@
           <w:rPr>
             <w:rStyle w:val="Hyperlink"/>
             <w:rFonts w:ascii="Times New Roman" w:hAnsi="Times New Roman" w:cs="Times New Roman"/>
-            <w:b/>
-            <w:bCs/>
             <w:sz w:val="22"/>
             <w:szCs w:val="22"/>
           </w:rPr>
-          <w:t>i</w:t>
+          <w:t xml:space="preserve">ind, </w:t>
         </w:r>
         <w:r>
           <w:rPr>
             <w:rStyle w:val="Hyperlink"/>
             <w:rFonts w:ascii="Times New Roman" w:hAnsi="Times New Roman" w:cs="Times New Roman"/>
-            <w:b/>
-            <w:bCs/>
-            <w:sz w:val="22"/>
-            <w:szCs w:val="22"/>
-          </w:rPr>
-          <w:t xml:space="preserve">nd, </w:t>
-        </w:r>
-        <w:r>
-          <w:rPr>
-            <w:rStyle w:val="Hyperlink"/>
-            <w:rFonts w:ascii="Times New Roman" w:hAnsi="Times New Roman" w:cs="Times New Roman"/>
-            <w:b/>
-            <w:bCs/>
             <w:sz w:val="22"/>
             <w:szCs w:val="22"/>
           </w:rPr>
@@ -4885,8 +4922,6 @@
           <w:rPr>
             <w:rStyle w:val="Hyperlink"/>
             <w:rFonts w:ascii="Times New Roman" w:hAnsi="Times New Roman" w:cs="Times New Roman"/>
-            <w:b/>
-            <w:bCs/>
             <w:sz w:val="22"/>
             <w:szCs w:val="22"/>
           </w:rPr>
@@ -4896,8 +4931,6 @@
           <w:rPr>
             <w:rStyle w:val="Hyperlink"/>
             <w:rFonts w:ascii="Times New Roman" w:hAnsi="Times New Roman" w:cs="Times New Roman"/>
-            <w:b/>
-            <w:bCs/>
             <w:sz w:val="22"/>
             <w:szCs w:val="22"/>
           </w:rPr>
@@ -4907,8 +4940,6 @@
           <w:rPr>
             <w:rStyle w:val="Hyperlink"/>
             <w:rFonts w:ascii="Times New Roman" w:hAnsi="Times New Roman" w:cs="Times New Roman"/>
-            <w:b/>
-            <w:bCs/>
             <w:sz w:val="22"/>
             <w:szCs w:val="22"/>
           </w:rPr>
@@ -4918,21 +4949,11 @@
       <w:r>
         <w:rPr>
           <w:rFonts w:ascii="Times New Roman" w:hAnsi="Times New Roman" w:cs="Times New Roman"/>
-          <w:b/>
-          <w:bCs/>
           <w:sz w:val="22"/>
           <w:szCs w:val="22"/>
         </w:rPr>
         <w:t xml:space="preserve"> concentration at CSU is a research-oriented program, focused on preparing students to enter cognitive/behavioral neuroscience, cognitive psychology, and sensation &amp; perception focused fields. </w:t>
       </w:r>
-    </w:p>
-    <w:p>
-      <w:pPr>
-        <w:rPr>
-          <w:sz w:val="22"/>
-          <w:szCs w:val="22"/>
-        </w:rPr>
-      </w:pPr>
     </w:p>
     <w:sectPr>
       <w:pgSz w:w="12240" w:h="15840"/>

</xml_diff>